<commit_message>
Adicionando verificação de 8 dígitos para senha, alterando imagem de kruangs, e adicionando documentação final
</commit_message>
<xml_diff>
--- a/Documentação/Documentação Muay Thai.docx
+++ b/Documentação/Documentação Muay Thai.docx
@@ -786,7 +786,22 @@
         <w:t>Contexto...............................................................4</w:t>
       </w:r>
     </w:p>
-    <w:p xmlns:wp14="http://schemas.microsoft.com/office/word/2010/wordml" wp14:paraId="2BA43178" wp14:textId="40CF258A">
+    <w:p>
+      <w:pPr>
+        <w:pStyle w:val="Normal"/>
+      </w:pPr>
+      <w:r>
+        <w:rPr>
+          <w:rFonts w:ascii="Aptos" w:hAnsi="Aptos" w:eastAsia="Aptos" w:cs="Aptos"/>
+          <w:noProof w:val="0"/>
+          <w:sz w:val="40"/>
+          <w:szCs w:val="40"/>
+          <w:lang w:val="pt-BR"/>
+        </w:rPr>
+        <w:t>Objetivos de Desenvolvimento Sustentável (ODS) ..4</w:t>
+      </w:r>
+    </w:p>
+    <w:p xmlns:wp14="http://schemas.microsoft.com/office/word/2010/wordml" wp14:paraId="2BA43178" wp14:textId="1A732E00">
       <w:pPr>
         <w:jc w:val="left"/>
         <w:rPr>
@@ -819,7 +834,24 @@
           <w:szCs w:val="40"/>
           <w:lang w:val="pt-BR"/>
         </w:rPr>
-        <w:t>Objetivo................................................................4</w:t>
+        <w:t>Objetivo................................................................</w:t>
+      </w:r>
+      <w:r>
+        <w:rPr>
+          <w:rFonts w:ascii="Aptos" w:hAnsi="Aptos" w:eastAsia="Aptos" w:cs="Aptos"/>
+          <w:b w:val="0"/>
+          <w:bCs w:val="0"/>
+          <w:i w:val="0"/>
+          <w:iCs w:val="0"/>
+          <w:caps w:val="0"/>
+          <w:smallCaps w:val="0"/>
+          <w:noProof w:val="0"/>
+          <w:color w:val="000000" w:themeColor="text1" w:themeTint="FF" w:themeShade="FF"/>
+          <w:sz w:val="40"/>
+          <w:szCs w:val="40"/>
+          <w:lang w:val="pt-BR"/>
+        </w:rPr>
+        <w:t>5</w:t>
       </w:r>
     </w:p>
     <w:p xmlns:wp14="http://schemas.microsoft.com/office/word/2010/wordml" wp14:paraId="27101CA1" wp14:textId="7E3BA009">
@@ -858,7 +890,7 @@
         <w:t>Justificativa...........................................................5</w:t>
       </w:r>
     </w:p>
-    <w:p xmlns:wp14="http://schemas.microsoft.com/office/word/2010/wordml" wp14:paraId="19CB09F2" wp14:textId="5AB2C65D">
+    <w:p xmlns:wp14="http://schemas.microsoft.com/office/word/2010/wordml" wp14:paraId="19CB09F2" wp14:textId="17DC654E">
       <w:pPr>
         <w:jc w:val="left"/>
         <w:rPr>
@@ -891,10 +923,27 @@
           <w:szCs w:val="40"/>
           <w:lang w:val="pt-BR"/>
         </w:rPr>
-        <w:t>Escopo.................................................................5</w:t>
-      </w:r>
-    </w:p>
-    <w:p xmlns:wp14="http://schemas.microsoft.com/office/word/2010/wordml" wp14:paraId="0A6CF47A" wp14:textId="6C0006C8">
+        <w:t>Escopo.................................................................</w:t>
+      </w:r>
+      <w:r>
+        <w:rPr>
+          <w:rFonts w:ascii="Aptos" w:hAnsi="Aptos" w:eastAsia="Aptos" w:cs="Aptos"/>
+          <w:b w:val="0"/>
+          <w:bCs w:val="0"/>
+          <w:i w:val="0"/>
+          <w:iCs w:val="0"/>
+          <w:caps w:val="0"/>
+          <w:smallCaps w:val="0"/>
+          <w:noProof w:val="0"/>
+          <w:color w:val="000000" w:themeColor="text1" w:themeTint="FF" w:themeShade="FF"/>
+          <w:sz w:val="40"/>
+          <w:szCs w:val="40"/>
+          <w:lang w:val="pt-BR"/>
+        </w:rPr>
+        <w:t>6</w:t>
+      </w:r>
+    </w:p>
+    <w:p xmlns:wp14="http://schemas.microsoft.com/office/word/2010/wordml" wp14:paraId="0A6CF47A" wp14:textId="6DF74F83">
       <w:pPr>
         <w:jc w:val="left"/>
         <w:rPr>
@@ -927,10 +976,27 @@
           <w:szCs w:val="40"/>
           <w:lang w:val="pt-BR"/>
         </w:rPr>
-        <w:t>Resultado Esperado..............................................5</w:t>
-      </w:r>
-    </w:p>
-    <w:p xmlns:wp14="http://schemas.microsoft.com/office/word/2010/wordml" wp14:paraId="1AC722FC" wp14:textId="4458B1BB">
+        <w:t>Resultado Esperado..............................................</w:t>
+      </w:r>
+      <w:r>
+        <w:rPr>
+          <w:rFonts w:ascii="Aptos" w:hAnsi="Aptos" w:eastAsia="Aptos" w:cs="Aptos"/>
+          <w:b w:val="0"/>
+          <w:bCs w:val="0"/>
+          <w:i w:val="0"/>
+          <w:iCs w:val="0"/>
+          <w:caps w:val="0"/>
+          <w:smallCaps w:val="0"/>
+          <w:noProof w:val="0"/>
+          <w:color w:val="000000" w:themeColor="text1" w:themeTint="FF" w:themeShade="FF"/>
+          <w:sz w:val="40"/>
+          <w:szCs w:val="40"/>
+          <w:lang w:val="pt-BR"/>
+        </w:rPr>
+        <w:t>6</w:t>
+      </w:r>
+    </w:p>
+    <w:p xmlns:wp14="http://schemas.microsoft.com/office/word/2010/wordml" wp14:paraId="1AC722FC" wp14:textId="6D6E4F9E">
       <w:pPr>
         <w:jc w:val="left"/>
         <w:rPr>
@@ -983,7 +1049,7 @@
         <w:t>6</w:t>
       </w:r>
     </w:p>
-    <w:p xmlns:wp14="http://schemas.microsoft.com/office/word/2010/wordml" wp14:paraId="11D75433" wp14:textId="2D67FDEC">
+    <w:p xmlns:wp14="http://schemas.microsoft.com/office/word/2010/wordml" wp14:paraId="11D75433" wp14:textId="6F0F4C9D">
       <w:pPr>
         <w:pStyle w:val="Normal"/>
         <w:suppressLineNumbers w:val="0"/>
@@ -1072,10 +1138,10 @@
           <w:szCs w:val="40"/>
           <w:lang w:val="pt-BR"/>
         </w:rPr>
-        <w:t>6</w:t>
-      </w:r>
-    </w:p>
-    <w:p xmlns:wp14="http://schemas.microsoft.com/office/word/2010/wordml" wp14:paraId="4F08A1B1" wp14:textId="787C527C">
+        <w:t>7</w:t>
+      </w:r>
+    </w:p>
+    <w:p xmlns:wp14="http://schemas.microsoft.com/office/word/2010/wordml" wp14:paraId="4F08A1B1" wp14:textId="3C5A2D83">
       <w:pPr>
         <w:pStyle w:val="Normal"/>
         <w:suppressLineNumbers w:val="0"/>
@@ -1113,10 +1179,27 @@
           <w:szCs w:val="40"/>
           <w:lang w:val="pt-BR"/>
         </w:rPr>
-        <w:t>Diagrama de Solução Técnica................................6</w:t>
-      </w:r>
-    </w:p>
-    <w:p xmlns:wp14="http://schemas.microsoft.com/office/word/2010/wordml" wp14:paraId="0814E1FB" wp14:textId="78C3703C">
+        <w:t>Diagrama de Solução Técnica................................</w:t>
+      </w:r>
+      <w:r>
+        <w:rPr>
+          <w:rFonts w:ascii="Aptos" w:hAnsi="Aptos" w:eastAsia="Aptos" w:cs="Aptos"/>
+          <w:b w:val="0"/>
+          <w:bCs w:val="0"/>
+          <w:i w:val="0"/>
+          <w:iCs w:val="0"/>
+          <w:caps w:val="0"/>
+          <w:smallCaps w:val="0"/>
+          <w:noProof w:val="0"/>
+          <w:color w:val="000000" w:themeColor="text1" w:themeTint="FF" w:themeShade="FF"/>
+          <w:sz w:val="40"/>
+          <w:szCs w:val="40"/>
+          <w:lang w:val="pt-BR"/>
+        </w:rPr>
+        <w:t>7</w:t>
+      </w:r>
+    </w:p>
+    <w:p xmlns:wp14="http://schemas.microsoft.com/office/word/2010/wordml" wp14:paraId="0814E1FB" wp14:textId="79682DA6">
       <w:pPr>
         <w:pStyle w:val="Normal"/>
         <w:suppressLineNumbers w:val="0"/>
@@ -1140,10 +1223,27 @@
           <w:szCs w:val="40"/>
           <w:lang w:val="pt-BR"/>
         </w:rPr>
-        <w:t>Backlog................................................................7</w:t>
-      </w:r>
-    </w:p>
-    <w:p xmlns:wp14="http://schemas.microsoft.com/office/word/2010/wordml" wp14:paraId="226E291B" wp14:textId="005BB105">
+        <w:t>Backlog................................................................</w:t>
+      </w:r>
+      <w:r>
+        <w:rPr>
+          <w:rFonts w:ascii="Aptos" w:hAnsi="Aptos" w:eastAsia="Aptos" w:cs="Aptos"/>
+          <w:b w:val="0"/>
+          <w:bCs w:val="0"/>
+          <w:i w:val="0"/>
+          <w:iCs w:val="0"/>
+          <w:caps w:val="0"/>
+          <w:smallCaps w:val="0"/>
+          <w:noProof w:val="0"/>
+          <w:color w:val="000000" w:themeColor="text1" w:themeTint="FF" w:themeShade="FF"/>
+          <w:sz w:val="40"/>
+          <w:szCs w:val="40"/>
+          <w:lang w:val="pt-BR"/>
+        </w:rPr>
+        <w:t>8</w:t>
+      </w:r>
+    </w:p>
+    <w:p>
       <w:pPr>
         <w:jc w:val="left"/>
         <w:rPr>
@@ -1193,8 +1293,122 @@
           <w:szCs w:val="40"/>
           <w:lang w:val="pt-BR"/>
         </w:rPr>
-        <w:t>7</w:t>
-      </w:r>
+        <w:t>8</w:t>
+      </w:r>
+    </w:p>
+    <w:p>
+      <w:pPr>
+        <w:jc w:val="left"/>
+        <w:rPr>
+          <w:rFonts w:ascii="Aptos" w:hAnsi="Aptos" w:eastAsia="Aptos" w:cs="Aptos"/>
+          <w:b w:val="0"/>
+          <w:bCs w:val="0"/>
+          <w:i w:val="0"/>
+          <w:iCs w:val="0"/>
+          <w:caps w:val="0"/>
+          <w:smallCaps w:val="0"/>
+          <w:noProof w:val="0"/>
+          <w:color w:val="000000" w:themeColor="text1" w:themeTint="FF" w:themeShade="FF"/>
+          <w:sz w:val="40"/>
+          <w:szCs w:val="40"/>
+          <w:lang w:val="pt-BR"/>
+        </w:rPr>
+      </w:pPr>
+    </w:p>
+    <w:p>
+      <w:pPr>
+        <w:jc w:val="left"/>
+        <w:rPr>
+          <w:rFonts w:ascii="Aptos" w:hAnsi="Aptos" w:eastAsia="Aptos" w:cs="Aptos"/>
+          <w:b w:val="0"/>
+          <w:bCs w:val="0"/>
+          <w:i w:val="0"/>
+          <w:iCs w:val="0"/>
+          <w:caps w:val="0"/>
+          <w:smallCaps w:val="0"/>
+          <w:noProof w:val="0"/>
+          <w:color w:val="000000" w:themeColor="text1" w:themeTint="FF" w:themeShade="FF"/>
+          <w:sz w:val="40"/>
+          <w:szCs w:val="40"/>
+          <w:lang w:val="pt-BR"/>
+        </w:rPr>
+      </w:pPr>
+    </w:p>
+    <w:p>
+      <w:pPr>
+        <w:jc w:val="left"/>
+        <w:rPr>
+          <w:rFonts w:ascii="Aptos" w:hAnsi="Aptos" w:eastAsia="Aptos" w:cs="Aptos"/>
+          <w:b w:val="0"/>
+          <w:bCs w:val="0"/>
+          <w:i w:val="0"/>
+          <w:iCs w:val="0"/>
+          <w:caps w:val="0"/>
+          <w:smallCaps w:val="0"/>
+          <w:noProof w:val="0"/>
+          <w:color w:val="000000" w:themeColor="text1" w:themeTint="FF" w:themeShade="FF"/>
+          <w:sz w:val="40"/>
+          <w:szCs w:val="40"/>
+          <w:lang w:val="pt-BR"/>
+        </w:rPr>
+      </w:pPr>
+    </w:p>
+    <w:p>
+      <w:pPr>
+        <w:jc w:val="left"/>
+        <w:rPr>
+          <w:rFonts w:ascii="Aptos" w:hAnsi="Aptos" w:eastAsia="Aptos" w:cs="Aptos"/>
+          <w:b w:val="0"/>
+          <w:bCs w:val="0"/>
+          <w:i w:val="0"/>
+          <w:iCs w:val="0"/>
+          <w:caps w:val="0"/>
+          <w:smallCaps w:val="0"/>
+          <w:noProof w:val="0"/>
+          <w:color w:val="000000" w:themeColor="text1" w:themeTint="FF" w:themeShade="FF"/>
+          <w:sz w:val="40"/>
+          <w:szCs w:val="40"/>
+          <w:lang w:val="pt-BR"/>
+        </w:rPr>
+      </w:pPr>
+    </w:p>
+    <w:p>
+      <w:pPr>
+        <w:jc w:val="left"/>
+        <w:rPr>
+          <w:rFonts w:ascii="Aptos" w:hAnsi="Aptos" w:eastAsia="Aptos" w:cs="Aptos"/>
+          <w:b w:val="0"/>
+          <w:bCs w:val="0"/>
+          <w:i w:val="0"/>
+          <w:iCs w:val="0"/>
+          <w:caps w:val="0"/>
+          <w:smallCaps w:val="0"/>
+          <w:noProof w:val="0"/>
+          <w:color w:val="000000" w:themeColor="text1" w:themeTint="FF" w:themeShade="FF"/>
+          <w:sz w:val="40"/>
+          <w:szCs w:val="40"/>
+          <w:lang w:val="pt-BR"/>
+        </w:rPr>
+      </w:pPr>
+    </w:p>
+    <w:p>
+      <w:pPr>
+        <w:jc w:val="left"/>
+        <w:rPr>
+          <w:rFonts w:ascii="Aptos" w:hAnsi="Aptos" w:eastAsia="Aptos" w:cs="Aptos"/>
+          <w:b w:val="0"/>
+          <w:bCs w:val="0"/>
+          <w:i w:val="0"/>
+          <w:iCs w:val="0"/>
+          <w:caps w:val="0"/>
+          <w:smallCaps w:val="0"/>
+          <w:noProof w:val="0"/>
+          <w:color w:val="000000" w:themeColor="text1" w:themeTint="FF" w:themeShade="FF"/>
+          <w:sz w:val="40"/>
+          <w:szCs w:val="40"/>
+          <w:lang w:val="pt-BR"/>
+        </w:rPr>
+      </w:pPr>
     </w:p>
     <w:p>
       <w:pPr>
@@ -1341,7 +1555,7 @@
       </w:pPr>
       <w:r>
         <w:drawing>
-          <wp:inline wp14:editId="4A5BCC20" wp14:anchorId="4496289E">
+          <wp:inline wp14:editId="2053313F" wp14:anchorId="4496289E">
             <wp:extent cx="3863125" cy="2279165"/>
             <wp:effectExtent l="0" t="0" r="0" b="0"/>
             <wp:docPr id="1779044433" name="drawing"/>
@@ -1383,24 +1597,155 @@
         </w:drawing>
       </w:r>
     </w:p>
-    <w:p xmlns:wp14="http://schemas.microsoft.com/office/word/2010/wordml" wp14:paraId="6C3BA0E9" wp14:textId="75EFED21">
+    <w:p xmlns:wp14="http://schemas.microsoft.com/office/word/2010/wordml" wp14:paraId="52CF5A05" wp14:textId="629C8FAD">
       <w:pPr>
         <w:pStyle w:val="Normal"/>
-        <w:rPr>
-          <w:rFonts w:ascii="Aptos" w:hAnsi="Aptos" w:eastAsia="Aptos" w:cs="Aptos"/>
-          <w:b w:val="0"/>
-          <w:bCs w:val="0"/>
-          <w:i w:val="0"/>
-          <w:iCs w:val="0"/>
-          <w:caps w:val="0"/>
-          <w:smallCaps w:val="0"/>
-          <w:noProof w:val="0"/>
-          <w:color w:val="000000" w:themeColor="text1" w:themeTint="FF" w:themeShade="FF"/>
-          <w:sz w:val="24"/>
-          <w:szCs w:val="24"/>
-          <w:lang w:val="pt-BR"/>
-        </w:rPr>
-      </w:pPr>
+        <w:ind w:firstLine="708"/>
+        <w:jc w:val="left"/>
+      </w:pPr>
+    </w:p>
+    <w:p xmlns:wp14="http://schemas.microsoft.com/office/word/2010/wordml" wp14:paraId="6CD54129" wp14:textId="16887E3B">
+      <w:pPr>
+        <w:pStyle w:val="Normal"/>
+      </w:pPr>
+      <w:r>
+        <w:rPr>
+          <w:rFonts w:ascii="Aptos" w:hAnsi="Aptos" w:eastAsia="Aptos" w:cs="Aptos"/>
+          <w:noProof w:val="0"/>
+          <w:sz w:val="40"/>
+          <w:szCs w:val="40"/>
+          <w:lang w:val="pt-BR"/>
+        </w:rPr>
+        <w:t>Objetivos de Desenvolvimento Sustentável (ODS)</w:t>
+      </w:r>
+    </w:p>
+    <w:p xmlns:wp14="http://schemas.microsoft.com/office/word/2010/wordml" wp14:paraId="6C3BA0E9" wp14:textId="06094219">
+      <w:pPr>
+        <w:pStyle w:val="Normal"/>
+        <w:rPr>
+          <w:rFonts w:ascii="Aptos" w:hAnsi="Aptos" w:eastAsia="Aptos" w:cs="Aptos"/>
+          <w:noProof w:val="0"/>
+          <w:sz w:val="24"/>
+          <w:szCs w:val="24"/>
+          <w:lang w:val="pt-BR"/>
+        </w:rPr>
+      </w:pPr>
+      <w:r>
+        <w:rPr>
+          <w:rFonts w:ascii="Aptos" w:hAnsi="Aptos" w:eastAsia="Aptos" w:cs="Aptos"/>
+          <w:b w:val="0"/>
+          <w:bCs w:val="0"/>
+          <w:i w:val="0"/>
+          <w:iCs w:val="0"/>
+          <w:caps w:val="0"/>
+          <w:smallCaps w:val="0"/>
+          <w:noProof w:val="0"/>
+          <w:color w:val="000000" w:themeColor="text1" w:themeTint="FF" w:themeShade="FF"/>
+          <w:sz w:val="24"/>
+          <w:szCs w:val="24"/>
+          <w:lang w:val="pt-BR"/>
+        </w:rPr>
+        <w:t xml:space="preserve">O </w:t>
+      </w:r>
+      <w:r>
+        <w:rPr>
+          <w:rFonts w:ascii="Aptos" w:hAnsi="Aptos" w:eastAsia="Aptos" w:cs="Aptos"/>
+          <w:noProof w:val="0"/>
+          <w:sz w:val="24"/>
+          <w:szCs w:val="24"/>
+          <w:lang w:val="pt-BR"/>
+        </w:rPr>
+        <w:t xml:space="preserve">Objetivos de Desenvolvimento Sustentável (ODS) atingida é a terceira ODS, sendo a de saúde e bem-estar, por se tratar de uma arte marcial que envolve principalmente </w:t>
+      </w:r>
+      <w:r>
+        <w:rPr>
+          <w:rFonts w:ascii="Aptos" w:hAnsi="Aptos" w:eastAsia="Aptos" w:cs="Aptos"/>
+          <w:noProof w:val="0"/>
+          <w:sz w:val="24"/>
+          <w:szCs w:val="24"/>
+          <w:lang w:val="pt-BR"/>
+        </w:rPr>
+        <w:t>manter um corpo saudável, forte e resistente</w:t>
+      </w:r>
+      <w:r>
+        <w:rPr>
+          <w:rFonts w:ascii="Aptos" w:hAnsi="Aptos" w:eastAsia="Aptos" w:cs="Aptos"/>
+          <w:noProof w:val="0"/>
+          <w:sz w:val="24"/>
+          <w:szCs w:val="24"/>
+          <w:lang w:val="pt-BR"/>
+        </w:rPr>
+        <w:t>, com treinos e fortalecimento muscular. A</w:t>
+      </w:r>
+      <w:r>
+        <w:rPr>
+          <w:rFonts w:ascii="Aptos" w:hAnsi="Aptos" w:eastAsia="Aptos" w:cs="Aptos"/>
+          <w:noProof w:val="0"/>
+          <w:sz w:val="24"/>
+          <w:szCs w:val="24"/>
+          <w:lang w:val="pt-BR"/>
+        </w:rPr>
+        <w:t>ssim, se relacionando muito ao que diz a ODS de saúde e bem-estar</w:t>
+      </w:r>
+      <w:r>
+        <w:rPr>
+          <w:rFonts w:ascii="Aptos" w:hAnsi="Aptos" w:eastAsia="Aptos" w:cs="Aptos"/>
+          <w:noProof w:val="0"/>
+          <w:sz w:val="24"/>
+          <w:szCs w:val="24"/>
+          <w:lang w:val="pt-BR"/>
+        </w:rPr>
+        <w:t>: “Assegurar uma vida saudável e promover o bem-estar para todos, em todas as idades”.</w:t>
+      </w:r>
+    </w:p>
+    <w:p>
+      <w:pPr>
+        <w:pStyle w:val="Normal"/>
+        <w:jc w:val="center"/>
+      </w:pPr>
+      <w:r>
+        <w:drawing>
+          <wp:inline wp14:editId="4711CFE6" wp14:anchorId="2F78E320">
+            <wp:extent cx="3232213" cy="3219899"/>
+            <wp:effectExtent l="0" t="0" r="0" b="0"/>
+            <wp:docPr id="185166354" name="drawing"/>
+            <wp:cNvGraphicFramePr>
+              <a:graphicFrameLocks noChangeAspect="1"/>
+            </wp:cNvGraphicFramePr>
+            <a:graphic>
+              <a:graphicData xmlns:a="http://schemas.openxmlformats.org/drawingml/2006/main" uri="http://schemas.openxmlformats.org/drawingml/2006/picture">
+                <pic:pic xmlns:pic="http://schemas.openxmlformats.org/drawingml/2006/picture">
+                  <pic:nvPicPr>
+                    <pic:cNvPr id="185166354" name="Picture 185166354"/>
+                    <pic:cNvPicPr/>
+                  </pic:nvPicPr>
+                  <pic:blipFill>
+                    <a:blip xmlns:r="http://schemas.openxmlformats.org/officeDocument/2006/relationships" r:embed="rId228166696">
+                      <a:extLst>
+                        <a:ext uri="{28A0092B-C50C-407E-A947-70E740481C1C}">
+                          <a14:useLocalDpi xmlns:a14="http://schemas.microsoft.com/office/drawing/2010/main"/>
+                        </a:ext>
+                      </a:extLst>
+                    </a:blip>
+                    <a:stretch>
+                      <a:fillRect/>
+                    </a:stretch>
+                  </pic:blipFill>
+                  <pic:spPr>
+                    <a:xfrm rot="0">
+                      <a:off x="0" y="0"/>
+                      <a:ext cx="3232213" cy="3219899"/>
+                    </a:xfrm>
+                    <a:prstGeom prst="rect">
+                      <a:avLst/>
+                    </a:prstGeom>
+                  </pic:spPr>
+                </pic:pic>
+              </a:graphicData>
+            </a:graphic>
+          </wp:inline>
+        </w:drawing>
+      </w:r>
     </w:p>
     <w:p xmlns:wp14="http://schemas.microsoft.com/office/word/2010/wordml" wp14:paraId="120D7540" wp14:textId="1001F65A">
       <w:pPr>
@@ -2180,6 +2525,69 @@
         </w:rPr>
         <w:t>Para o bom funcionamento do projeto, é esperado que a Maquina Virtual suporte o Banco de dados para armazenar as informações, o usuário insira os dados corretamente ou próximos aos da realidade, o computador seja capaz de suportar o processo de utilização do site, como carregar imagens, fazer os cálculos necessários para o funcionamento do site institucional.</w:t>
       </w:r>
+    </w:p>
+    <w:p>
+      <w:pPr>
+        <w:spacing w:before="0" w:beforeAutospacing="off" w:after="160" w:afterAutospacing="off" w:line="279" w:lineRule="auto"/>
+        <w:ind w:left="0" w:right="0" w:firstLine="708"/>
+        <w:jc w:val="left"/>
+        <w:rPr>
+          <w:rFonts w:ascii="Aptos" w:hAnsi="Aptos" w:eastAsia="Aptos" w:cs="Aptos"/>
+          <w:b w:val="0"/>
+          <w:bCs w:val="0"/>
+          <w:i w:val="0"/>
+          <w:iCs w:val="0"/>
+          <w:caps w:val="0"/>
+          <w:smallCaps w:val="0"/>
+          <w:noProof w:val="0"/>
+          <w:color w:val="000000" w:themeColor="text1" w:themeTint="FF" w:themeShade="FF"/>
+          <w:sz w:val="24"/>
+          <w:szCs w:val="24"/>
+          <w:lang w:val="pt-BR"/>
+        </w:rPr>
+      </w:pPr>
+    </w:p>
+    <w:p>
+      <w:pPr>
+        <w:spacing w:before="0" w:beforeAutospacing="off" w:after="160" w:afterAutospacing="off" w:line="279" w:lineRule="auto"/>
+        <w:ind w:left="0" w:right="0" w:firstLine="708"/>
+        <w:jc w:val="left"/>
+        <w:rPr>
+          <w:rFonts w:ascii="Aptos" w:hAnsi="Aptos" w:eastAsia="Aptos" w:cs="Aptos"/>
+          <w:b w:val="0"/>
+          <w:bCs w:val="0"/>
+          <w:i w:val="0"/>
+          <w:iCs w:val="0"/>
+          <w:caps w:val="0"/>
+          <w:smallCaps w:val="0"/>
+          <w:noProof w:val="0"/>
+          <w:color w:val="000000" w:themeColor="text1" w:themeTint="FF" w:themeShade="FF"/>
+          <w:sz w:val="24"/>
+          <w:szCs w:val="24"/>
+          <w:lang w:val="pt-BR"/>
+        </w:rPr>
+      </w:pPr>
+    </w:p>
+    <w:p>
+      <w:pPr>
+        <w:spacing w:before="0" w:beforeAutospacing="off" w:after="160" w:afterAutospacing="off" w:line="279" w:lineRule="auto"/>
+        <w:ind w:left="0" w:right="0" w:firstLine="708"/>
+        <w:jc w:val="left"/>
+        <w:rPr>
+          <w:rFonts w:ascii="Aptos" w:hAnsi="Aptos" w:eastAsia="Aptos" w:cs="Aptos"/>
+          <w:b w:val="0"/>
+          <w:bCs w:val="0"/>
+          <w:i w:val="0"/>
+          <w:iCs w:val="0"/>
+          <w:caps w:val="0"/>
+          <w:smallCaps w:val="0"/>
+          <w:noProof w:val="0"/>
+          <w:color w:val="000000" w:themeColor="text1" w:themeTint="FF" w:themeShade="FF"/>
+          <w:sz w:val="24"/>
+          <w:szCs w:val="24"/>
+          <w:lang w:val="pt-BR"/>
+        </w:rPr>
+      </w:pPr>
     </w:p>
     <w:p>
       <w:pPr>
@@ -2364,7 +2772,7 @@
       </w:pPr>
       <w:r>
         <w:drawing>
-          <wp:inline wp14:editId="1C4F267E" wp14:anchorId="33442C4D">
+          <wp:inline wp14:editId="66422D2B" wp14:anchorId="33442C4D">
             <wp:extent cx="4819650" cy="2694513"/>
             <wp:effectExtent l="0" t="0" r="0" b="0"/>
             <wp:docPr id="48664311" name="drawing"/>
@@ -2405,6 +2813,69 @@
           </wp:inline>
         </w:drawing>
       </w:r>
+    </w:p>
+    <w:p>
+      <w:pPr>
+        <w:pStyle w:val="Normal"/>
+        <w:bidi w:val="0"/>
+        <w:spacing w:before="0" w:beforeAutospacing="off" w:after="160" w:afterAutospacing="off" w:line="279" w:lineRule="auto"/>
+        <w:ind w:left="0" w:right="0"/>
+        <w:jc w:val="center"/>
+      </w:pPr>
+    </w:p>
+    <w:p>
+      <w:pPr>
+        <w:pStyle w:val="Normal"/>
+        <w:bidi w:val="0"/>
+        <w:spacing w:before="0" w:beforeAutospacing="off" w:after="160" w:afterAutospacing="off" w:line="279" w:lineRule="auto"/>
+        <w:ind w:left="0" w:right="0"/>
+        <w:jc w:val="center"/>
+      </w:pPr>
+    </w:p>
+    <w:p>
+      <w:pPr>
+        <w:pStyle w:val="Normal"/>
+        <w:bidi w:val="0"/>
+        <w:spacing w:before="0" w:beforeAutospacing="off" w:after="160" w:afterAutospacing="off" w:line="279" w:lineRule="auto"/>
+        <w:ind w:left="0" w:right="0"/>
+        <w:jc w:val="center"/>
+      </w:pPr>
+    </w:p>
+    <w:p>
+      <w:pPr>
+        <w:pStyle w:val="Normal"/>
+        <w:bidi w:val="0"/>
+        <w:spacing w:before="0" w:beforeAutospacing="off" w:after="160" w:afterAutospacing="off" w:line="279" w:lineRule="auto"/>
+        <w:ind w:left="0" w:right="0"/>
+        <w:jc w:val="center"/>
+      </w:pPr>
+    </w:p>
+    <w:p>
+      <w:pPr>
+        <w:pStyle w:val="Normal"/>
+        <w:bidi w:val="0"/>
+        <w:spacing w:before="0" w:beforeAutospacing="off" w:after="160" w:afterAutospacing="off" w:line="279" w:lineRule="auto"/>
+        <w:ind w:left="0" w:right="0"/>
+        <w:jc w:val="center"/>
+      </w:pPr>
+    </w:p>
+    <w:p>
+      <w:pPr>
+        <w:pStyle w:val="Normal"/>
+        <w:bidi w:val="0"/>
+        <w:spacing w:before="0" w:beforeAutospacing="off" w:after="160" w:afterAutospacing="off" w:line="279" w:lineRule="auto"/>
+        <w:ind w:left="0" w:right="0"/>
+        <w:jc w:val="center"/>
+      </w:pPr>
+    </w:p>
+    <w:p>
+      <w:pPr>
+        <w:pStyle w:val="Normal"/>
+        <w:bidi w:val="0"/>
+        <w:spacing w:before="0" w:beforeAutospacing="off" w:after="160" w:afterAutospacing="off" w:line="279" w:lineRule="auto"/>
+        <w:ind w:left="0" w:right="0"/>
+        <w:jc w:val="center"/>
+      </w:pPr>
     </w:p>
     <w:p>
       <w:pPr>
@@ -2624,40 +3095,29 @@
     </w:p>
     <w:p>
       <w:pPr>
+        <w:pStyle w:val="Normal"/>
+        <w:suppressLineNumbers w:val="0"/>
+        <w:bidi w:val="0"/>
         <w:spacing w:before="0" w:beforeAutospacing="off" w:after="160" w:afterAutospacing="off" w:line="279" w:lineRule="auto"/>
-        <w:ind w:left="0" w:right="0" w:firstLine="708"/>
+        <w:ind w:left="0" w:right="0" w:firstLine="0"/>
         <w:jc w:val="left"/>
-        <w:rPr>
-          <w:rFonts w:ascii="Aptos" w:hAnsi="Aptos" w:eastAsia="Aptos" w:cs="Aptos"/>
-          <w:b w:val="0"/>
-          <w:bCs w:val="0"/>
-          <w:i w:val="0"/>
-          <w:iCs w:val="0"/>
-          <w:caps w:val="0"/>
-          <w:smallCaps w:val="0"/>
-          <w:noProof w:val="0"/>
-          <w:color w:val="000000" w:themeColor="text1" w:themeTint="FF" w:themeShade="FF"/>
-          <w:sz w:val="40"/>
-          <w:szCs w:val="40"/>
-          <w:lang w:val="pt-BR"/>
-        </w:rPr>
-      </w:pPr>
-      <w:r>
-        <w:rPr>
-          <w:rFonts w:ascii="Aptos" w:hAnsi="Aptos" w:eastAsia="Aptos" w:cs="Aptos"/>
-          <w:b w:val="0"/>
-          <w:bCs w:val="0"/>
-          <w:i w:val="0"/>
-          <w:iCs w:val="0"/>
-          <w:caps w:val="0"/>
-          <w:smallCaps w:val="0"/>
-          <w:noProof w:val="0"/>
-          <w:color w:val="000000" w:themeColor="text1" w:themeTint="FF" w:themeShade="FF"/>
-          <w:sz w:val="40"/>
-          <w:szCs w:val="40"/>
-          <w:lang w:val="pt-BR"/>
-        </w:rPr>
-        <w:t>Bibliografia</w:t>
+      </w:pPr>
+      <w:r>
+        <w:rPr>
+          <w:rFonts w:ascii="Aptos" w:hAnsi="Aptos" w:eastAsia="Aptos" w:cs="Aptos"/>
+          <w:b w:val="0"/>
+          <w:bCs w:val="0"/>
+          <w:i w:val="0"/>
+          <w:iCs w:val="0"/>
+          <w:caps w:val="0"/>
+          <w:smallCaps w:val="0"/>
+          <w:noProof w:val="0"/>
+          <w:color w:val="000000" w:themeColor="text1" w:themeTint="FF" w:themeShade="FF"/>
+          <w:sz w:val="40"/>
+          <w:szCs w:val="40"/>
+          <w:lang w:val="pt-BR"/>
+        </w:rPr>
+        <w:t>Referências bibliográficas</w:t>
       </w:r>
     </w:p>
     <w:p>
@@ -2698,6 +3158,42 @@
           <w:smallCaps w:val="0"/>
           <w:noProof w:val="0"/>
           <w:color w:val="000000" w:themeColor="text1" w:themeTint="FF" w:themeShade="FF"/>
+          <w:sz w:val="36"/>
+          <w:szCs w:val="36"/>
+          <w:lang w:val="pt-BR"/>
+        </w:rPr>
+      </w:pPr>
+      <w:r>
+        <w:rPr>
+          <w:rFonts w:ascii="Aptos" w:hAnsi="Aptos" w:eastAsia="Aptos" w:cs="Aptos"/>
+          <w:b w:val="0"/>
+          <w:bCs w:val="0"/>
+          <w:i w:val="0"/>
+          <w:iCs w:val="0"/>
+          <w:caps w:val="0"/>
+          <w:smallCaps w:val="0"/>
+          <w:noProof w:val="0"/>
+          <w:color w:val="000000" w:themeColor="text1" w:themeTint="FF" w:themeShade="FF"/>
+          <w:sz w:val="36"/>
+          <w:szCs w:val="36"/>
+          <w:lang w:val="pt-BR"/>
+        </w:rPr>
+        <w:t>Imagens</w:t>
+      </w:r>
+    </w:p>
+    <w:p>
+      <w:pPr>
+        <w:pStyle w:val="Normal"/>
+        <w:rPr>
+          <w:rFonts w:ascii="Aptos" w:hAnsi="Aptos" w:eastAsia="Aptos" w:cs="Aptos"/>
+          <w:b w:val="0"/>
+          <w:bCs w:val="0"/>
+          <w:i w:val="0"/>
+          <w:iCs w:val="0"/>
+          <w:caps w:val="0"/>
+          <w:smallCaps w:val="0"/>
+          <w:noProof w:val="0"/>
+          <w:color w:val="000000" w:themeColor="text1" w:themeTint="FF" w:themeShade="FF"/>
           <w:sz w:val="28"/>
           <w:szCs w:val="28"/>
           <w:lang w:val="pt-BR"/>
@@ -2705,102 +3201,226 @@
       </w:pPr>
       <w:r>
         <w:rPr>
-          <w:rFonts w:ascii="Aptos" w:hAnsi="Aptos" w:eastAsia="Aptos" w:cs="Aptos"/>
-          <w:b w:val="0"/>
-          <w:bCs w:val="0"/>
-          <w:i w:val="0"/>
-          <w:iCs w:val="0"/>
-          <w:caps w:val="0"/>
-          <w:smallCaps w:val="0"/>
-          <w:noProof w:val="0"/>
-          <w:color w:val="000000" w:themeColor="text1" w:themeTint="FF" w:themeShade="FF"/>
-          <w:sz w:val="28"/>
-          <w:szCs w:val="28"/>
-          <w:lang w:val="pt-BR"/>
-        </w:rPr>
-        <w:t>Imagens</w:t>
-      </w:r>
-    </w:p>
-    <w:p>
+          <w:noProof w:val="0"/>
+          <w:lang w:val="pt-BR"/>
+        </w:rPr>
+        <w:t>https://www.estilomma.pt/blog/o-que-e-o-muay-thai</w:t>
+      </w:r>
+    </w:p>
+    <w:p xmlns:wp14="http://schemas.microsoft.com/office/word/2010/wordml" wp14:paraId="74B9C5CD" wp14:textId="3714334F">
       <w:pPr>
         <w:pStyle w:val="Normal"/>
-        <w:spacing w:before="0" w:beforeAutospacing="off" w:after="160" w:afterAutospacing="off" w:line="279" w:lineRule="auto"/>
-        <w:ind w:left="0" w:right="0" w:firstLine="708"/>
-        <w:jc w:val="left"/>
-        <w:rPr>
-          <w:rFonts w:ascii="Aptos" w:hAnsi="Aptos" w:eastAsia="Aptos" w:cs="Aptos"/>
-          <w:b w:val="0"/>
-          <w:bCs w:val="0"/>
-          <w:i w:val="0"/>
-          <w:iCs w:val="0"/>
-          <w:caps w:val="0"/>
-          <w:smallCaps w:val="0"/>
-          <w:noProof w:val="0"/>
-          <w:color w:val="000000" w:themeColor="text1" w:themeTint="FF" w:themeShade="FF"/>
-          <w:sz w:val="28"/>
-          <w:szCs w:val="28"/>
-          <w:lang w:val="pt-BR"/>
-        </w:rPr>
-      </w:pPr>
-      <w:r>
-        <w:rPr>
-          <w:rFonts w:ascii="Aptos" w:hAnsi="Aptos" w:eastAsia="Aptos" w:cs="Aptos"/>
-          <w:b w:val="0"/>
-          <w:bCs w:val="0"/>
-          <w:i w:val="0"/>
-          <w:iCs w:val="0"/>
-          <w:caps w:val="0"/>
-          <w:smallCaps w:val="0"/>
-          <w:noProof w:val="0"/>
-          <w:color w:val="000000" w:themeColor="text1" w:themeTint="FF" w:themeShade="FF"/>
-          <w:sz w:val="28"/>
-          <w:szCs w:val="28"/>
-          <w:lang w:val="pt-BR"/>
-        </w:rPr>
-        <w:t>https://www.estilomma.pt/blog/o-que-e-o-muay-thai</w:t>
-      </w:r>
-    </w:p>
-    <w:p xmlns:wp14="http://schemas.microsoft.com/office/word/2010/wordml" wp14:paraId="5D9A5F7C" wp14:textId="5C8512B2">
-      <w:pPr>
-        <w:spacing w:before="0" w:beforeAutospacing="off" w:after="160" w:afterAutospacing="off" w:line="279" w:lineRule="auto"/>
-        <w:ind w:left="0" w:right="0" w:firstLine="708"/>
-        <w:jc w:val="left"/>
-        <w:rPr>
-          <w:rFonts w:ascii="Aptos" w:hAnsi="Aptos" w:eastAsia="Aptos" w:cs="Aptos"/>
-          <w:b w:val="0"/>
-          <w:bCs w:val="0"/>
-          <w:i w:val="0"/>
-          <w:iCs w:val="0"/>
-          <w:caps w:val="0"/>
-          <w:smallCaps w:val="0"/>
-          <w:noProof w:val="0"/>
-          <w:color w:val="000000" w:themeColor="text1" w:themeTint="FF" w:themeShade="FF"/>
-          <w:sz w:val="24"/>
-          <w:szCs w:val="24"/>
-          <w:highlight w:val="yellow"/>
-          <w:lang w:val="pt-BR"/>
-        </w:rPr>
-      </w:pPr>
-    </w:p>
-    <w:p xmlns:wp14="http://schemas.microsoft.com/office/word/2010/wordml" wp14:paraId="7F0770AF" wp14:textId="4CF9B44B">
-      <w:pPr>
-        <w:rPr>
-          <w:rFonts w:ascii="Aptos" w:hAnsi="Aptos" w:eastAsia="Aptos" w:cs="Aptos"/>
-          <w:b w:val="0"/>
-          <w:bCs w:val="0"/>
-          <w:i w:val="0"/>
-          <w:iCs w:val="0"/>
-          <w:caps w:val="0"/>
-          <w:smallCaps w:val="0"/>
-          <w:noProof w:val="0"/>
-          <w:color w:val="000000" w:themeColor="text1" w:themeTint="FF" w:themeShade="FF"/>
-          <w:sz w:val="24"/>
-          <w:szCs w:val="24"/>
-          <w:lang w:val="pt-BR"/>
-        </w:rPr>
-      </w:pPr>
-    </w:p>
-    <w:p xmlns:wp14="http://schemas.microsoft.com/office/word/2010/wordml" wp14:paraId="1E207724" wp14:textId="729E9A11"/>
+        <w:rPr>
+          <w:noProof w:val="0"/>
+          <w:lang w:val="pt-BR"/>
+        </w:rPr>
+      </w:pPr>
+      <w:hyperlink r:id="R05c552e9e06c48d4">
+        <w:r>
+          <w:rPr>
+            <w:rStyle w:val="Hyperlink"/>
+            <w:noProof w:val="0"/>
+            <w:lang w:val="pt-BR"/>
+          </w:rPr>
+          <w:t>https://muaythaipara.com.br/historia/</w:t>
+        </w:r>
+      </w:hyperlink>
+    </w:p>
+    <w:p xmlns:wp14="http://schemas.microsoft.com/office/word/2010/wordml" wp14:paraId="417990F3" wp14:textId="3473B187">
+      <w:pPr>
+        <w:pStyle w:val="Normal"/>
+        <w:rPr>
+          <w:noProof w:val="0"/>
+          <w:lang w:val="pt-BR"/>
+        </w:rPr>
+      </w:pPr>
+      <w:hyperlink r:id="R8c700d6ddeb845a5">
+        <w:r>
+          <w:rPr>
+            <w:rStyle w:val="Hyperlink"/>
+            <w:noProof w:val="0"/>
+            <w:lang w:val="pt-BR"/>
+          </w:rPr>
+          <w:t>https://depositphotos.com/br/photos/wrestling-ring-background.html</w:t>
+        </w:r>
+      </w:hyperlink>
+    </w:p>
+    <w:p xmlns:wp14="http://schemas.microsoft.com/office/word/2010/wordml" wp14:paraId="7A3C2CFA" wp14:textId="5C29E667">
+      <w:pPr>
+        <w:pStyle w:val="Normal"/>
+        <w:rPr>
+          <w:noProof w:val="0"/>
+          <w:lang w:val="pt-BR"/>
+        </w:rPr>
+      </w:pPr>
+      <w:r>
+        <w:rPr>
+          <w:noProof w:val="0"/>
+          <w:lang w:val="pt-BR"/>
+        </w:rPr>
+        <w:t>https://i.pinimg.com/1200x/37/f1/51/37f15163a75a66723a0643da0217c405.jp</w:t>
+      </w:r>
+      <w:r>
+        <w:rPr>
+          <w:noProof w:val="0"/>
+          <w:lang w:val="pt-BR"/>
+        </w:rPr>
+        <w:t>g</w:t>
+      </w:r>
+      <w:r>
+        <w:tab/>
+      </w:r>
+    </w:p>
+    <w:p xmlns:wp14="http://schemas.microsoft.com/office/word/2010/wordml" wp14:paraId="586F96EC" wp14:textId="150529CB">
+      <w:pPr>
+        <w:pStyle w:val="Normal"/>
+        <w:rPr>
+          <w:noProof w:val="0"/>
+          <w:lang w:val="pt-BR"/>
+        </w:rPr>
+      </w:pPr>
+      <w:hyperlink r:id="R6ca2f72010d640fb">
+        <w:r>
+          <w:rPr>
+            <w:rStyle w:val="Hyperlink"/>
+            <w:noProof w:val="0"/>
+            <w:lang w:val="pt-BR"/>
+          </w:rPr>
+          <w:t>https://i.pinimg.com/736x/ad/c0/62/adc062e9eb46a5d6de9d3a9058f14b6d.jpg</w:t>
+        </w:r>
+      </w:hyperlink>
+    </w:p>
+    <w:p xmlns:wp14="http://schemas.microsoft.com/office/word/2010/wordml" wp14:paraId="0D6235F0" wp14:textId="32BE5B36">
+      <w:pPr>
+        <w:pStyle w:val="Normal"/>
+        <w:rPr>
+          <w:noProof w:val="0"/>
+          <w:lang w:val="pt-BR"/>
+        </w:rPr>
+      </w:pPr>
+      <w:hyperlink r:id="R83dd9ba7a0384f97">
+        <w:r>
+          <w:rPr>
+            <w:rStyle w:val="Hyperlink"/>
+            <w:noProof w:val="0"/>
+            <w:lang w:val="pt-BR"/>
+          </w:rPr>
+          <w:t>https://i.pinimg.com/736x/25/58/95/255895c5c159315b7442bd906174b8e3.jpg</w:t>
+        </w:r>
+      </w:hyperlink>
+    </w:p>
+    <w:p xmlns:wp14="http://schemas.microsoft.com/office/word/2010/wordml" wp14:paraId="7F0770AF" wp14:textId="0D59A9AC">
+      <w:pPr>
+        <w:pStyle w:val="Normal"/>
+        <w:rPr>
+          <w:noProof w:val="0"/>
+          <w:lang w:val="pt-BR"/>
+        </w:rPr>
+      </w:pPr>
+      <w:hyperlink r:id="R61cd42dfeee14595">
+        <w:r>
+          <w:rPr>
+            <w:rStyle w:val="Hyperlink"/>
+            <w:noProof w:val="0"/>
+            <w:lang w:val="pt-BR"/>
+          </w:rPr>
+          <w:t>https://i.pinimg.com/1200x/ae/48/4e/ae484ed4ef8d28b62d4643c89b64fc2f.jpg</w:t>
+        </w:r>
+      </w:hyperlink>
+    </w:p>
+    <w:p>
+      <w:pPr>
+        <w:pStyle w:val="Normal"/>
+        <w:rPr>
+          <w:noProof w:val="0"/>
+          <w:lang w:val="pt-BR"/>
+        </w:rPr>
+      </w:pPr>
+      <w:hyperlink r:id="R45592bf65d3d4eda">
+        <w:r>
+          <w:rPr>
+            <w:rStyle w:val="Hyperlink"/>
+            <w:noProof w:val="0"/>
+            <w:lang w:val="pt-BR"/>
+          </w:rPr>
+          <w:t>https://www.esportelandia.com.br/artes-marciais/tudo-sobre-muay-thai/</w:t>
+        </w:r>
+      </w:hyperlink>
+    </w:p>
+    <w:p>
+      <w:pPr>
+        <w:pStyle w:val="Normal"/>
+        <w:rPr>
+          <w:noProof w:val="0"/>
+          <w:lang w:val="pt-BR"/>
+        </w:rPr>
+      </w:pPr>
+    </w:p>
+    <w:p xmlns:wp14="http://schemas.microsoft.com/office/word/2010/wordml" wp14:paraId="1E207724" wp14:textId="69EC1DBB">
+      <w:pPr>
+        <w:rPr>
+          <w:sz w:val="40"/>
+          <w:szCs w:val="40"/>
+        </w:rPr>
+      </w:pPr>
+      <w:r>
+        <w:rPr>
+          <w:sz w:val="36"/>
+          <w:szCs w:val="36"/>
+          <w:u w:val="single"/>
+        </w:rPr>
+        <w:t>Referências</w:t>
+      </w:r>
+      <w:r>
+        <w:rPr>
+          <w:sz w:val="36"/>
+          <w:szCs w:val="36"/>
+        </w:rPr>
+        <w:t xml:space="preserve"> e pesquisas</w:t>
+      </w:r>
+    </w:p>
+    <w:p>
+      <w:pPr>
+        <w:pStyle w:val="Normal"/>
+        <w:rPr>
+          <w:noProof w:val="0"/>
+          <w:lang w:val="pt-BR"/>
+        </w:rPr>
+      </w:pPr>
+      <w:r>
+        <w:rPr>
+          <w:noProof w:val="0"/>
+          <w:lang w:val="pt-BR"/>
+        </w:rPr>
+        <w:t>https://www.esportelandia.com.br/artes-marciais/tudo-sobre-muay-thai/</w:t>
+      </w:r>
+    </w:p>
+    <w:p>
+      <w:hyperlink r:id="Rd074d93b77a24162">
+        <w:r>
+          <w:rPr>
+            <w:rStyle w:val="Hyperlink"/>
+          </w:rPr>
+          <w:t>https://www.tigermuaythai.com/about-muay-thai/history</w:t>
+        </w:r>
+      </w:hyperlink>
+    </w:p>
+    <w:p>
+      <w:hyperlink r:id="Rc01e3a534cc34701">
+        <w:r>
+          <w:rPr>
+            <w:rStyle w:val="Hyperlink"/>
+          </w:rPr>
+          <w:t>https://www.w3schools.com/css/</w:t>
+        </w:r>
+      </w:hyperlink>
+    </w:p>
+    <w:p>
+      <w:r>
+        <w:rPr/>
+        <w:t>https://www.ipea.gov.br/ods/ods3.html</w:t>
+      </w:r>
+    </w:p>
     <w:sectPr>
       <w:pgSz w:w="11906" w:h="16838" w:orient="portrait"/>
       <w:pgMar w:top="1440" w:right="1440" w:bottom="1440" w:left="1440" w:header="720" w:footer="720" w:gutter="0"/>
@@ -3232,6 +3852,17 @@
     <w:semiHidden/>
     <w:unhideWhenUsed/>
   </w:style>
+  <w:style w:type="character" w:styleId="Hyperlink">
+    <w:uiPriority w:val="99"/>
+    <w:name w:val="Hyperlink"/>
+    <w:basedOn w:val="DefaultParagraphFont"/>
+    <w:unhideWhenUsed/>
+    <w:rsid w:val="2B30CC37"/>
+    <w:rPr>
+      <w:color w:val="467886"/>
+      <w:u w:val="single"/>
+    </w:rPr>
+  </w:style>
 </w:styles>
 </file>
 

</xml_diff>